<commit_message>
feat: update report docs, figure generation scripts, and detailed evaluation metrics
</commit_message>
<xml_diff>
--- a/docs/Mau-bao-cao_Do An Nganh.docx
+++ b/docs/Mau-bao-cao_Do An Nganh.docx
@@ -1,6 +1,6 @@
 
 <file path=word/document.xml><?xml version="1.0" encoding="utf-8"?>
-<w:document xmlns:wpc="http://schemas.microsoft.com/office/word/2010/wordprocessingCanvas" xmlns:cx="http://schemas.microsoft.com/office/drawing/2014/chartex" xmlns:cx1="http://schemas.microsoft.com/office/drawing/2015/9/8/chartex" xmlns:cx2="http://schemas.microsoft.com/office/drawing/2015/10/21/chartex" xmlns:cx3="http://schemas.microsoft.com/office/drawing/2016/5/9/chartex" xmlns:cx4="http://schemas.microsoft.com/office/drawing/2016/5/10/chartex" xmlns:cx5="http://schemas.microsoft.com/office/drawing/2016/5/11/chartex" xmlns:cx6="http://schemas.microsoft.com/office/drawing/2016/5/12/chartex" xmlns:cx7="http://schemas.microsoft.com/office/drawing/2016/5/13/chartex" xmlns:cx8="http://schemas.microsoft.com/office/drawing/2016/5/14/chartex" xmlns:mc="http://schemas.openxmlformats.org/markup-compatibility/2006" xmlns:aink="http://schemas.microsoft.com/office/drawing/2016/ink" xmlns:am3d="http://schemas.microsoft.com/office/drawing/2017/model3d" xmlns:o="urn:schemas-microsoft-com:office:office" xmlns:oel="http://schemas.microsoft.com/office/2019/extlst" xmlns:r="http://schemas.openxmlformats.org/officeDocument/2006/relationships" xmlns:m="http://schemas.openxmlformats.org/officeDocument/2006/math" xmlns:v="urn:schemas-microsoft-com:vml" xmlns:wp14="http://schemas.microsoft.com/office/word/2010/wordprocessingDrawing" xmlns:wp="http://schemas.openxmlformats.org/drawingml/2006/wordprocessingDrawing" xmlns:w10="urn:schemas-microsoft-com:office:word" xmlns:w="http://schemas.openxmlformats.org/wordprocessingml/2006/main" xmlns:w14="http://schemas.microsoft.com/office/word/2010/wordml" xmlns:w15="http://schemas.microsoft.com/office/word/2012/wordml" xmlns:w16cei="http://schemas.microsoft.com/office/word/2026/wordml/cei" xmlns:w16cex="http://schemas.microsoft.com/office/word/2018/wordml/cex" xmlns:w16cid="http://schemas.microsoft.com/office/word/2016/wordml/cid" xmlns:w16="http://schemas.microsoft.com/office/word/2018/wordml" xmlns:w16du="http://schemas.microsoft.com/office/word/2023/wordml/word16du" xmlns:w16sdtdh="http://schemas.microsoft.com/office/word/2020/wordml/sdtdatahash" xmlns:w16sdtfl="http://schemas.microsoft.com/office/word/2024/wordml/sdtformatlock" xmlns:w16se="http://schemas.microsoft.com/office/word/2015/wordml/symex" xmlns:wpg="http://schemas.microsoft.com/office/word/2010/wordprocessingGroup" xmlns:wpi="http://schemas.microsoft.com/office/word/2010/wordprocessingInk" xmlns:wne="http://schemas.microsoft.com/office/word/2006/wordml" xmlns:wps="http://schemas.microsoft.com/office/word/2010/wordprocessingShape" mc:Ignorable="w14 w15 w16se w16cid w16 w16cex w16sdtdh w16sdtfl w16du wp14">
+<w:document xmlns:wpc="http://schemas.microsoft.com/office/word/2010/wordprocessingCanvas" xmlns:cx="http://schemas.microsoft.com/office/drawing/2014/chartex" xmlns:cx1="http://schemas.microsoft.com/office/drawing/2015/9/8/chartex" xmlns:cx2="http://schemas.microsoft.com/office/drawing/2015/10/21/chartex" xmlns:cx3="http://schemas.microsoft.com/office/drawing/2016/5/9/chartex" xmlns:cx4="http://schemas.microsoft.com/office/drawing/2016/5/10/chartex" xmlns:cx5="http://schemas.microsoft.com/office/drawing/2016/5/11/chartex" xmlns:cx6="http://schemas.microsoft.com/office/drawing/2016/5/12/chartex" xmlns:cx7="http://schemas.microsoft.com/office/drawing/2016/5/13/chartex" xmlns:cx8="http://schemas.microsoft.com/office/drawing/2016/5/14/chartex" xmlns:mc="http://schemas.openxmlformats.org/markup-compatibility/2006" xmlns:aink="http://schemas.microsoft.com/office/drawing/2016/ink" xmlns:am3d="http://schemas.microsoft.com/office/drawing/2017/model3d" xmlns:o="urn:schemas-microsoft-com:office:office" xmlns:oel="http://schemas.microsoft.com/office/2019/extlst" xmlns:r="http://schemas.openxmlformats.org/officeDocument/2006/relationships" xmlns:m="http://schemas.openxmlformats.org/officeDocument/2006/math" xmlns:v="urn:schemas-microsoft-com:vml" xmlns:wp14="http://schemas.microsoft.com/office/word/2010/wordprocessingDrawing" xmlns:wp="http://schemas.openxmlformats.org/drawingml/2006/wordprocessingDrawing" xmlns:w10="urn:schemas-microsoft-com:office:word" xmlns:w="http://schemas.openxmlformats.org/wordprocessingml/2006/main" xmlns:w14="http://schemas.microsoft.com/office/word/2010/wordml" xmlns:w15="http://schemas.microsoft.com/office/word/2012/wordml" xmlns:w16cex="http://schemas.microsoft.com/office/word/2018/wordml/cex" xmlns:w16cid="http://schemas.microsoft.com/office/word/2016/wordml/cid" xmlns:w16="http://schemas.microsoft.com/office/word/2018/wordml" xmlns:w16du="http://schemas.microsoft.com/office/word/2023/wordml/word16du" xmlns:w16sdtdh="http://schemas.microsoft.com/office/word/2020/wordml/sdtdatahash" xmlns:w16sdtfl="http://schemas.microsoft.com/office/word/2024/wordml/sdtformatlock" xmlns:w16se="http://schemas.microsoft.com/office/word/2015/wordml/symex" xmlns:wpg="http://schemas.microsoft.com/office/word/2010/wordprocessingGroup" xmlns:wpi="http://schemas.microsoft.com/office/word/2010/wordprocessingInk" xmlns:wne="http://schemas.microsoft.com/office/word/2006/wordml" xmlns:wps="http://schemas.microsoft.com/office/word/2010/wordprocessingShape" mc:Ignorable="w14 w15 w16se w16cid w16 w16cex w16sdtdh w16sdtfl w16du wp14">
   <w:body>
     <w:p>
       <w:pPr>
@@ -1479,6 +1479,7 @@
         </w:rPr>
       </w:pPr>
       <w:bookmarkStart w:id="2" w:name="_heading=h.3dbxca8c5gir" w:colFirst="0" w:colLast="0"/>
+      <w:bookmarkStart w:id="3" w:name="_Hlk239760187"/>
       <w:bookmarkEnd w:id="2"/>
       <w:r>
         <w:rPr>
@@ -2204,6 +2205,62 @@
         <w:rPr>
           <w:lang w:val="en-US"/>
         </w:rPr>
+        <w:t xml:space="preserve"> </w:t>
+      </w:r>
+      <w:proofErr w:type="spellStart"/>
+      <w:r>
+        <w:rPr>
+          <w:lang w:val="en-US"/>
+        </w:rPr>
+        <w:t>học</w:t>
+      </w:r>
+      <w:proofErr w:type="spellEnd"/>
+      <w:r>
+        <w:rPr>
+          <w:lang w:val="en-US"/>
+        </w:rPr>
+        <w:t xml:space="preserve"> </w:t>
+      </w:r>
+      <w:proofErr w:type="spellStart"/>
+      <w:r>
+        <w:rPr>
+          <w:lang w:val="en-US"/>
+        </w:rPr>
+        <w:t>không</w:t>
+      </w:r>
+      <w:proofErr w:type="spellEnd"/>
+      <w:r>
+        <w:rPr>
+          <w:lang w:val="en-US"/>
+        </w:rPr>
+        <w:t xml:space="preserve"> </w:t>
+      </w:r>
+      <w:proofErr w:type="spellStart"/>
+      <w:r>
+        <w:rPr>
+          <w:lang w:val="en-US"/>
+        </w:rPr>
+        <w:t>giám</w:t>
+      </w:r>
+      <w:proofErr w:type="spellEnd"/>
+      <w:r>
+        <w:rPr>
+          <w:lang w:val="en-US"/>
+        </w:rPr>
+        <w:t xml:space="preserve"> </w:t>
+      </w:r>
+      <w:proofErr w:type="spellStart"/>
+      <w:r>
+        <w:rPr>
+          <w:lang w:val="en-US"/>
+        </w:rPr>
+        <w:t>sát</w:t>
+      </w:r>
+      <w:proofErr w:type="spellEnd"/>
+      <w:r>
+        <w:rPr>
+          <w:lang w:val="en-US"/>
+        </w:rPr>
         <w:t xml:space="preserve"> Isolation Forest </w:t>
       </w:r>
       <w:proofErr w:type="spellStart"/>
@@ -2392,7 +2449,223 @@
         <w:rPr>
           <w:lang w:val="en-US"/>
         </w:rPr>
-        <w:t xml:space="preserve">. </w:t>
+        <w:t xml:space="preserve">, </w:t>
+      </w:r>
+      <w:proofErr w:type="spellStart"/>
+      <w:r>
+        <w:rPr>
+          <w:lang w:val="en-US"/>
+        </w:rPr>
+        <w:t>trích</w:t>
+      </w:r>
+      <w:proofErr w:type="spellEnd"/>
+      <w:r>
+        <w:rPr>
+          <w:lang w:val="en-US"/>
+        </w:rPr>
+        <w:t xml:space="preserve"> </w:t>
+      </w:r>
+      <w:proofErr w:type="spellStart"/>
+      <w:r>
+        <w:rPr>
+          <w:lang w:val="en-US"/>
+        </w:rPr>
+        <w:t>xuất</w:t>
+      </w:r>
+      <w:proofErr w:type="spellEnd"/>
+      <w:r>
+        <w:rPr>
+          <w:lang w:val="en-US"/>
+        </w:rPr>
+        <w:t xml:space="preserve"> 9 </w:t>
+      </w:r>
+      <w:proofErr w:type="spellStart"/>
+      <w:r>
+        <w:rPr>
+          <w:lang w:val="en-US"/>
+        </w:rPr>
+        <w:t>đặc</w:t>
+      </w:r>
+      <w:proofErr w:type="spellEnd"/>
+      <w:r>
+        <w:rPr>
+          <w:lang w:val="en-US"/>
+        </w:rPr>
+        <w:t xml:space="preserve"> </w:t>
+      </w:r>
+      <w:proofErr w:type="spellStart"/>
+      <w:r>
+        <w:rPr>
+          <w:lang w:val="en-US"/>
+        </w:rPr>
+        <w:t>trưng</w:t>
+      </w:r>
+      <w:proofErr w:type="spellEnd"/>
+      <w:r>
+        <w:rPr>
+          <w:lang w:val="en-US"/>
+        </w:rPr>
+        <w:t xml:space="preserve"> </w:t>
+      </w:r>
+      <w:proofErr w:type="spellStart"/>
+      <w:r>
+        <w:rPr>
+          <w:lang w:val="en-US"/>
+        </w:rPr>
+        <w:t>chuỗi</w:t>
+      </w:r>
+      <w:proofErr w:type="spellEnd"/>
+      <w:r>
+        <w:rPr>
+          <w:lang w:val="en-US"/>
+        </w:rPr>
+        <w:t xml:space="preserve"> </w:t>
+      </w:r>
+      <w:proofErr w:type="spellStart"/>
+      <w:r>
+        <w:rPr>
+          <w:lang w:val="en-US"/>
+        </w:rPr>
+        <w:t>thời</w:t>
+      </w:r>
+      <w:proofErr w:type="spellEnd"/>
+      <w:r>
+        <w:rPr>
+          <w:lang w:val="en-US"/>
+        </w:rPr>
+        <w:t xml:space="preserve"> </w:t>
+      </w:r>
+      <w:proofErr w:type="spellStart"/>
+      <w:proofErr w:type="gramStart"/>
+      <w:r>
+        <w:rPr>
+          <w:lang w:val="en-US"/>
+        </w:rPr>
+        <w:t>gian</w:t>
+      </w:r>
+      <w:r>
+        <w:rPr>
+          <w:lang w:val="en-US"/>
+        </w:rPr>
+        <w:t>.</w:t>
+      </w:r>
+      <w:r>
+        <w:rPr>
+          <w:lang w:val="en-US"/>
+        </w:rPr>
+        <w:t>Sử</w:t>
+      </w:r>
+      <w:proofErr w:type="spellEnd"/>
+      <w:proofErr w:type="gramEnd"/>
+      <w:r>
+        <w:rPr>
+          <w:lang w:val="en-US"/>
+        </w:rPr>
+        <w:t xml:space="preserve"> </w:t>
+      </w:r>
+      <w:proofErr w:type="spellStart"/>
+      <w:r>
+        <w:rPr>
+          <w:lang w:val="en-US"/>
+        </w:rPr>
+        <w:t>dụng</w:t>
+      </w:r>
+      <w:proofErr w:type="spellEnd"/>
+      <w:r>
+        <w:rPr>
+          <w:lang w:val="en-US"/>
+        </w:rPr>
+        <w:t xml:space="preserve"> </w:t>
+      </w:r>
+      <w:proofErr w:type="spellStart"/>
+      <w:r>
+        <w:rPr>
+          <w:lang w:val="en-US"/>
+        </w:rPr>
+        <w:t>bộ</w:t>
+      </w:r>
+      <w:proofErr w:type="spellEnd"/>
+      <w:r>
+        <w:rPr>
+          <w:lang w:val="en-US"/>
+        </w:rPr>
+        <w:t xml:space="preserve"> dataset </w:t>
+      </w:r>
+      <w:proofErr w:type="spellStart"/>
+      <w:r>
+        <w:rPr>
+          <w:lang w:val="en-US"/>
+        </w:rPr>
+        <w:t>hơn</w:t>
+      </w:r>
+      <w:proofErr w:type="spellEnd"/>
+      <w:r>
+        <w:rPr>
+          <w:lang w:val="en-US"/>
+        </w:rPr>
+        <w:t xml:space="preserve"> 2 </w:t>
+      </w:r>
+      <w:proofErr w:type="spellStart"/>
+      <w:r>
+        <w:rPr>
+          <w:lang w:val="en-US"/>
+        </w:rPr>
+        <w:t>triệu</w:t>
+      </w:r>
+      <w:proofErr w:type="spellEnd"/>
+      <w:r>
+        <w:rPr>
+          <w:lang w:val="en-US"/>
+        </w:rPr>
+        <w:t xml:space="preserve"> </w:t>
+      </w:r>
+      <w:proofErr w:type="spellStart"/>
+      <w:r>
+        <w:rPr>
+          <w:lang w:val="en-US"/>
+        </w:rPr>
+        <w:t>dòng</w:t>
+      </w:r>
+      <w:proofErr w:type="spellEnd"/>
+      <w:r>
+        <w:rPr>
+          <w:lang w:val="en-US"/>
+        </w:rPr>
+        <w:t xml:space="preserve"> </w:t>
+      </w:r>
+      <w:proofErr w:type="spellStart"/>
+      <w:r>
+        <w:rPr>
+          <w:lang w:val="en-US"/>
+        </w:rPr>
+        <w:t>dữ</w:t>
+      </w:r>
+      <w:proofErr w:type="spellEnd"/>
+      <w:r>
+        <w:rPr>
+          <w:lang w:val="en-US"/>
+        </w:rPr>
+        <w:t xml:space="preserve"> </w:t>
+      </w:r>
+      <w:proofErr w:type="spellStart"/>
+      <w:r>
+        <w:rPr>
+          <w:lang w:val="en-US"/>
+        </w:rPr>
+        <w:t>liệu</w:t>
+      </w:r>
+      <w:proofErr w:type="spellEnd"/>
+      <w:r>
+        <w:rPr>
+          <w:lang w:val="en-US"/>
+        </w:rPr>
+        <w:t xml:space="preserve"> Household Electric Power Consumption .</w:t>
+      </w:r>
+      <w:r>
+        <w:rPr>
+          <w:lang w:val="en-US"/>
+        </w:rPr>
+        <w:t xml:space="preserve"> </w:t>
       </w:r>
       <w:r>
         <w:rPr>
@@ -2638,6 +2911,7 @@
         </w:rPr>
         <w:t xml:space="preserve"> real time mode.</w:t>
       </w:r>
+      <w:bookmarkEnd w:id="3"/>
       <w:r>
         <w:br w:type="page"/>
       </w:r>
@@ -2653,6 +2927,7 @@
           <w:lang w:val="en-US"/>
         </w:rPr>
       </w:pPr>
+      <w:bookmarkStart w:id="4" w:name="_Hlk239760272"/>
     </w:p>
     <w:p>
       <w:pPr>
@@ -2680,6 +2955,7 @@
         <w:t xml:space="preserve">ABSTRACT </w:t>
       </w:r>
     </w:p>
+    <w:bookmarkEnd w:id="4"/>
     <w:p>
       <w:pPr>
         <w:spacing w:after="200" w:line="276" w:lineRule="auto"/>
@@ -2708,6 +2984,7 @@
           <w:bCs/>
         </w:rPr>
       </w:pPr>
+      <w:bookmarkStart w:id="5" w:name="_Hlk239760214"/>
       <w:r>
         <w:rPr>
           <w:b/>
@@ -3867,6 +4144,7 @@
         </w:p>
       </w:sdtContent>
     </w:sdt>
+    <w:bookmarkEnd w:id="5"/>
     <w:p>
       <w:pPr>
         <w:spacing w:after="200" w:line="276" w:lineRule="auto"/>
@@ -3898,8 +4176,9 @@
           <w:color w:val="000000"/>
         </w:rPr>
       </w:pPr>
-      <w:bookmarkStart w:id="3" w:name="_heading=h.lzkc5lj67tfl" w:colFirst="0" w:colLast="0"/>
-      <w:bookmarkEnd w:id="3"/>
+      <w:bookmarkStart w:id="6" w:name="_heading=h.lzkc5lj67tfl" w:colFirst="0" w:colLast="0"/>
+      <w:bookmarkStart w:id="7" w:name="_Hlk239760293"/>
+      <w:bookmarkEnd w:id="6"/>
       <w:r>
         <w:rPr>
           <w:b/>
@@ -3909,6 +4188,7 @@
         <w:lastRenderedPageBreak/>
         <w:t>DANH MỤC TỪ VIẾT TẮT</w:t>
       </w:r>
+      <w:bookmarkEnd w:id="7"/>
       <w:r>
         <w:br w:type="page"/>
       </w:r>
@@ -3930,8 +4210,10 @@
           <w:color w:val="000000"/>
         </w:rPr>
       </w:pPr>
-      <w:bookmarkStart w:id="4" w:name="_heading=h.j1r79y8t41n6" w:colFirst="0" w:colLast="0"/>
-      <w:bookmarkEnd w:id="4"/>
+      <w:bookmarkStart w:id="8" w:name="_heading=h.j1r79y8t41n6" w:colFirst="0" w:colLast="0"/>
+      <w:bookmarkStart w:id="9" w:name="_Hlk239760324"/>
+      <w:bookmarkStart w:id="10" w:name="_Hlk239760347"/>
+      <w:bookmarkEnd w:id="8"/>
       <w:r>
         <w:rPr>
           <w:b/>
@@ -4017,8 +4299,8 @@
           <w:color w:val="000000"/>
         </w:rPr>
       </w:pPr>
-      <w:bookmarkStart w:id="5" w:name="_heading=h.d19o71rdegr6" w:colFirst="0" w:colLast="0"/>
-      <w:bookmarkEnd w:id="5"/>
+      <w:bookmarkStart w:id="11" w:name="_heading=h.d19o71rdegr6" w:colFirst="0" w:colLast="0"/>
+      <w:bookmarkEnd w:id="11"/>
       <w:r>
         <w:rPr>
           <w:b/>
@@ -4121,6 +4403,7 @@
         </w:p>
       </w:sdtContent>
     </w:sdt>
+    <w:bookmarkEnd w:id="9" w:displacedByCustomXml="prev"/>
     <w:p>
       <w:pPr>
         <w:pBdr>
@@ -4140,8 +4423,9 @@
           <w:szCs w:val="28"/>
         </w:rPr>
       </w:pPr>
-      <w:bookmarkStart w:id="6" w:name="_heading=h.64j32lvlqo5g" w:colFirst="0" w:colLast="0"/>
-      <w:bookmarkEnd w:id="6"/>
+      <w:bookmarkStart w:id="12" w:name="_heading=h.64j32lvlqo5g" w:colFirst="0" w:colLast="0"/>
+      <w:bookmarkEnd w:id="10"/>
+      <w:bookmarkEnd w:id="12"/>
     </w:p>
     <w:p>
       <w:pPr>
@@ -4192,8 +4476,8 @@
           <w:numId w:val="1"/>
         </w:numPr>
       </w:pPr>
-      <w:bookmarkStart w:id="7" w:name="_heading=h.oz56spib36k5" w:colFirst="0" w:colLast="0"/>
-      <w:bookmarkEnd w:id="7"/>
+      <w:bookmarkStart w:id="13" w:name="_heading=h.oz56spib36k5" w:colFirst="0" w:colLast="0"/>
+      <w:bookmarkEnd w:id="13"/>
       <w:r>
         <w:br w:type="page"/>
       </w:r>
@@ -4216,8 +4500,8 @@
           <w:lang w:val="en-US"/>
         </w:rPr>
       </w:pPr>
-      <w:bookmarkStart w:id="8" w:name="_heading=h.5trlr25ak9rz" w:colFirst="0" w:colLast="0"/>
-      <w:bookmarkEnd w:id="8"/>
+      <w:bookmarkStart w:id="14" w:name="_heading=h.5trlr25ak9rz" w:colFirst="0" w:colLast="0"/>
+      <w:bookmarkEnd w:id="14"/>
       <w:r>
         <w:rPr>
           <w:lang w:val="en-US"/>
@@ -4232,6 +4516,7 @@
           <w:lang w:val="en-US"/>
         </w:rPr>
       </w:pPr>
+      <w:bookmarkStart w:id="15" w:name="_Hlk239760462"/>
       <w:proofErr w:type="spellStart"/>
       <w:r>
         <w:rPr>
@@ -5597,6 +5882,7 @@
         <w:t xml:space="preserve"> 24/7.</w:t>
       </w:r>
     </w:p>
+    <w:bookmarkEnd w:id="15"/>
     <w:p>
       <w:pPr>
         <w:pStyle w:val="ListParagraph"/>
@@ -5628,8 +5914,8 @@
           <w:lang w:val="en-US"/>
         </w:rPr>
       </w:pPr>
-      <w:bookmarkStart w:id="9" w:name="_heading=h.qllafu7616f5" w:colFirst="0" w:colLast="0"/>
-      <w:bookmarkEnd w:id="9"/>
+      <w:bookmarkStart w:id="16" w:name="_heading=h.qllafu7616f5" w:colFirst="0" w:colLast="0"/>
+      <w:bookmarkEnd w:id="16"/>
       <w:r>
         <w:rPr>
           <w:lang w:val="en-US"/>
@@ -5708,6 +5994,7 @@
           <w:lang w:val="en-US"/>
         </w:rPr>
       </w:pPr>
+      <w:bookmarkStart w:id="17" w:name="_Hlk239760509"/>
       <w:proofErr w:type="spellStart"/>
       <w:r>
         <w:rPr>
@@ -6560,12 +6847,13 @@
           <w:lang w:val="en-US"/>
         </w:rPr>
       </w:pPr>
-      <w:bookmarkStart w:id="10" w:name="_heading=h.6u3t8ayo8zjl" w:colFirst="0" w:colLast="0"/>
-      <w:bookmarkStart w:id="11" w:name="_heading=h.9rj2s06bc3o5" w:colFirst="0" w:colLast="0"/>
-      <w:bookmarkStart w:id="12" w:name="_heading=h.7cjogj3giajv" w:colFirst="0" w:colLast="0"/>
-      <w:bookmarkEnd w:id="10"/>
-      <w:bookmarkEnd w:id="11"/>
-      <w:bookmarkEnd w:id="12"/>
+      <w:bookmarkStart w:id="18" w:name="_heading=h.6u3t8ayo8zjl" w:colFirst="0" w:colLast="0"/>
+      <w:bookmarkStart w:id="19" w:name="_heading=h.9rj2s06bc3o5" w:colFirst="0" w:colLast="0"/>
+      <w:bookmarkStart w:id="20" w:name="_heading=h.7cjogj3giajv" w:colFirst="0" w:colLast="0"/>
+      <w:bookmarkEnd w:id="17"/>
+      <w:bookmarkEnd w:id="18"/>
+      <w:bookmarkEnd w:id="19"/>
+      <w:bookmarkEnd w:id="20"/>
       <w:r>
         <w:rPr>
           <w:lang w:val="en-US"/>
@@ -10527,8 +10815,8 @@
           <w:lang w:val="en-US"/>
         </w:rPr>
       </w:pPr>
-      <w:bookmarkStart w:id="13" w:name="_heading=h.ofn9hn7kiv6v" w:colFirst="0" w:colLast="0"/>
-      <w:bookmarkEnd w:id="13"/>
+      <w:bookmarkStart w:id="21" w:name="_heading=h.ofn9hn7kiv6v" w:colFirst="0" w:colLast="0"/>
+      <w:bookmarkEnd w:id="21"/>
       <w:proofErr w:type="spellStart"/>
       <w:r>
         <w:rPr>
@@ -10618,8 +10906,8 @@
           <w:numId w:val="1"/>
         </w:numPr>
       </w:pPr>
-      <w:bookmarkStart w:id="14" w:name="_heading=h.mxsa71utuw2" w:colFirst="0" w:colLast="0"/>
-      <w:bookmarkEnd w:id="14"/>
+      <w:bookmarkStart w:id="22" w:name="_heading=h.mxsa71utuw2" w:colFirst="0" w:colLast="0"/>
+      <w:bookmarkEnd w:id="22"/>
       <w:proofErr w:type="spellStart"/>
       <w:r>
         <w:rPr>
@@ -10725,8 +11013,8 @@
           <w:lang w:val="en-US"/>
         </w:rPr>
       </w:pPr>
-      <w:bookmarkStart w:id="15" w:name="_heading=h.3zwm76hgforg" w:colFirst="0" w:colLast="0"/>
-      <w:bookmarkEnd w:id="15"/>
+      <w:bookmarkStart w:id="23" w:name="_heading=h.3zwm76hgforg" w:colFirst="0" w:colLast="0"/>
+      <w:bookmarkEnd w:id="23"/>
       <w:r>
         <w:rPr>
           <w:lang w:val="en-US"/>
@@ -10998,8 +11286,8 @@
           <w:numId w:val="1"/>
         </w:numPr>
       </w:pPr>
-      <w:bookmarkStart w:id="16" w:name="_heading=h.y0latiqxa0h7" w:colFirst="0" w:colLast="0"/>
-      <w:bookmarkEnd w:id="16"/>
+      <w:bookmarkStart w:id="24" w:name="_heading=h.y0latiqxa0h7" w:colFirst="0" w:colLast="0"/>
+      <w:bookmarkEnd w:id="24"/>
       <w:r>
         <w:t>Chủ đề cấp độ 3</w:t>
       </w:r>
@@ -11019,8 +11307,8 @@
           <w:color w:val="000000"/>
         </w:rPr>
       </w:pPr>
-      <w:bookmarkStart w:id="17" w:name="_heading=h.3i6617xjj7w" w:colFirst="0" w:colLast="0"/>
-      <w:bookmarkEnd w:id="17"/>
+      <w:bookmarkStart w:id="25" w:name="_heading=h.3i6617xjj7w" w:colFirst="0" w:colLast="0"/>
+      <w:bookmarkEnd w:id="25"/>
     </w:p>
     <w:p>
       <w:pPr>
@@ -11037,8 +11325,8 @@
           <w:color w:val="000000"/>
         </w:rPr>
       </w:pPr>
-      <w:bookmarkStart w:id="18" w:name="_heading=h.fngzl9xamunz" w:colFirst="0" w:colLast="0"/>
-      <w:bookmarkEnd w:id="18"/>
+      <w:bookmarkStart w:id="26" w:name="_heading=h.fngzl9xamunz" w:colFirst="0" w:colLast="0"/>
+      <w:bookmarkEnd w:id="26"/>
       <w:r>
         <w:rPr>
           <w:color w:val="000000"/>
@@ -11054,8 +11342,8 @@
           <w:numId w:val="1"/>
         </w:numPr>
       </w:pPr>
-      <w:bookmarkStart w:id="19" w:name="_heading=h.oq5s7v8yqvqi" w:colFirst="0" w:colLast="0"/>
-      <w:bookmarkEnd w:id="19"/>
+      <w:bookmarkStart w:id="27" w:name="_heading=h.oq5s7v8yqvqi" w:colFirst="0" w:colLast="0"/>
+      <w:bookmarkEnd w:id="27"/>
       <w:r>
         <w:t>Chủ đề cấp độ 2</w:t>
       </w:r>
@@ -11073,8 +11361,8 @@
           <w:cols w:space="720"/>
         </w:sectPr>
       </w:pPr>
-      <w:bookmarkStart w:id="20" w:name="_heading=h.72bytj2bc85t" w:colFirst="0" w:colLast="0"/>
-      <w:bookmarkEnd w:id="20"/>
+      <w:bookmarkStart w:id="28" w:name="_heading=h.72bytj2bc85t" w:colFirst="0" w:colLast="0"/>
+      <w:bookmarkEnd w:id="28"/>
       <w:r>
         <w:t>Chủ đề cấp độ 3</w:t>
       </w:r>
@@ -11087,8 +11375,8 @@
           <w:numId w:val="1"/>
         </w:numPr>
       </w:pPr>
-      <w:bookmarkStart w:id="21" w:name="_heading=h.7yvq1xle0hoc" w:colFirst="0" w:colLast="0"/>
-      <w:bookmarkEnd w:id="21"/>
+      <w:bookmarkStart w:id="29" w:name="_heading=h.7yvq1xle0hoc" w:colFirst="0" w:colLast="0"/>
+      <w:bookmarkEnd w:id="29"/>
       <w:r>
         <w:lastRenderedPageBreak/>
         <w:t>TÊN CHƯƠNG 3</w:t>
@@ -11102,8 +11390,8 @@
           <w:numId w:val="1"/>
         </w:numPr>
       </w:pPr>
-      <w:bookmarkStart w:id="22" w:name="_heading=h.8mywbdd8394i" w:colFirst="0" w:colLast="0"/>
-      <w:bookmarkEnd w:id="22"/>
+      <w:bookmarkStart w:id="30" w:name="_heading=h.8mywbdd8394i" w:colFirst="0" w:colLast="0"/>
+      <w:bookmarkEnd w:id="30"/>
       <w:r>
         <w:t>Chủ đề cấp độ 2</w:t>
       </w:r>
@@ -11126,8 +11414,8 @@
           <w:numId w:val="1"/>
         </w:numPr>
       </w:pPr>
-      <w:bookmarkStart w:id="23" w:name="_heading=h.hsglz56bwxbz" w:colFirst="0" w:colLast="0"/>
-      <w:bookmarkEnd w:id="23"/>
+      <w:bookmarkStart w:id="31" w:name="_heading=h.hsglz56bwxbz" w:colFirst="0" w:colLast="0"/>
+      <w:bookmarkEnd w:id="31"/>
       <w:r>
         <w:t>Chủ đề cấp độ 3</w:t>
       </w:r>
@@ -11140,8 +11428,8 @@
           <w:numId w:val="1"/>
         </w:numPr>
       </w:pPr>
-      <w:bookmarkStart w:id="24" w:name="_heading=h.80tseqaw1sc2" w:colFirst="0" w:colLast="0"/>
-      <w:bookmarkEnd w:id="24"/>
+      <w:bookmarkStart w:id="32" w:name="_heading=h.80tseqaw1sc2" w:colFirst="0" w:colLast="0"/>
+      <w:bookmarkEnd w:id="32"/>
       <w:r>
         <w:t>Chủ đề cấp độ 4</w:t>
       </w:r>
@@ -11154,8 +11442,8 @@
           <w:numId w:val="1"/>
         </w:numPr>
       </w:pPr>
-      <w:bookmarkStart w:id="25" w:name="_heading=h.u3q3aimrcbti" w:colFirst="0" w:colLast="0"/>
-      <w:bookmarkEnd w:id="25"/>
+      <w:bookmarkStart w:id="33" w:name="_heading=h.u3q3aimrcbti" w:colFirst="0" w:colLast="0"/>
+      <w:bookmarkEnd w:id="33"/>
       <w:r>
         <w:t>Chủ đề cấp độ 2</w:t>
       </w:r>
@@ -11170,8 +11458,8 @@
           <w:szCs w:val="28"/>
         </w:rPr>
       </w:pPr>
-      <w:bookmarkStart w:id="26" w:name="_heading=h.7b37x7vwv14z" w:colFirst="0" w:colLast="0"/>
-      <w:bookmarkEnd w:id="26"/>
+      <w:bookmarkStart w:id="34" w:name="_heading=h.7b37x7vwv14z" w:colFirst="0" w:colLast="0"/>
+      <w:bookmarkEnd w:id="34"/>
       <w:r>
         <w:br w:type="page"/>
       </w:r>
@@ -11193,8 +11481,8 @@
           <w:color w:val="000000"/>
         </w:rPr>
       </w:pPr>
-      <w:bookmarkStart w:id="27" w:name="_heading=h.vnyv5dqvhzm3" w:colFirst="0" w:colLast="0"/>
-      <w:bookmarkEnd w:id="27"/>
+      <w:bookmarkStart w:id="35" w:name="_heading=h.vnyv5dqvhzm3" w:colFirst="0" w:colLast="0"/>
+      <w:bookmarkEnd w:id="35"/>
       <w:r>
         <w:rPr>
           <w:b/>
@@ -11255,8 +11543,8 @@
           <w:color w:val="000000"/>
         </w:rPr>
       </w:pPr>
-      <w:bookmarkStart w:id="28" w:name="_heading=h.exuv9awoz4q1" w:colFirst="0" w:colLast="0"/>
-      <w:bookmarkEnd w:id="28"/>
+      <w:bookmarkStart w:id="36" w:name="_heading=h.exuv9awoz4q1" w:colFirst="0" w:colLast="0"/>
+      <w:bookmarkEnd w:id="36"/>
       <w:r>
         <w:rPr>
           <w:b/>
@@ -11277,7 +11565,7 @@
 </file>
 
 <file path=word/endnotes.xml><?xml version="1.0" encoding="utf-8"?>
-<w:endnotes xmlns:wpc="http://schemas.microsoft.com/office/word/2010/wordprocessingCanvas" xmlns:cx="http://schemas.microsoft.com/office/drawing/2014/chartex" xmlns:cx1="http://schemas.microsoft.com/office/drawing/2015/9/8/chartex" xmlns:cx2="http://schemas.microsoft.com/office/drawing/2015/10/21/chartex" xmlns:cx3="http://schemas.microsoft.com/office/drawing/2016/5/9/chartex" xmlns:cx4="http://schemas.microsoft.com/office/drawing/2016/5/10/chartex" xmlns:cx5="http://schemas.microsoft.com/office/drawing/2016/5/11/chartex" xmlns:cx6="http://schemas.microsoft.com/office/drawing/2016/5/12/chartex" xmlns:cx7="http://schemas.microsoft.com/office/drawing/2016/5/13/chartex" xmlns:cx8="http://schemas.microsoft.com/office/drawing/2016/5/14/chartex" xmlns:mc="http://schemas.openxmlformats.org/markup-compatibility/2006" xmlns:aink="http://schemas.microsoft.com/office/drawing/2016/ink" xmlns:am3d="http://schemas.microsoft.com/office/drawing/2017/model3d" xmlns:o="urn:schemas-microsoft-com:office:office" xmlns:oel="http://schemas.microsoft.com/office/2019/extlst" xmlns:r="http://schemas.openxmlformats.org/officeDocument/2006/relationships" xmlns:m="http://schemas.openxmlformats.org/officeDocument/2006/math" xmlns:v="urn:schemas-microsoft-com:vml" xmlns:wp14="http://schemas.microsoft.com/office/word/2010/wordprocessingDrawing" xmlns:wp="http://schemas.openxmlformats.org/drawingml/2006/wordprocessingDrawing" xmlns:w10="urn:schemas-microsoft-com:office:word" xmlns:w="http://schemas.openxmlformats.org/wordprocessingml/2006/main" xmlns:w14="http://schemas.microsoft.com/office/word/2010/wordml" xmlns:w15="http://schemas.microsoft.com/office/word/2012/wordml" xmlns:w16cei="http://schemas.microsoft.com/office/word/2026/wordml/cei" xmlns:w16cex="http://schemas.microsoft.com/office/word/2018/wordml/cex" xmlns:w16cid="http://schemas.microsoft.com/office/word/2016/wordml/cid" xmlns:w16="http://schemas.microsoft.com/office/word/2018/wordml" xmlns:w16du="http://schemas.microsoft.com/office/word/2023/wordml/word16du" xmlns:w16sdtdh="http://schemas.microsoft.com/office/word/2020/wordml/sdtdatahash" xmlns:w16sdtfl="http://schemas.microsoft.com/office/word/2024/wordml/sdtformatlock" xmlns:w16se="http://schemas.microsoft.com/office/word/2015/wordml/symex" xmlns:wpg="http://schemas.microsoft.com/office/word/2010/wordprocessingGroup" xmlns:wpi="http://schemas.microsoft.com/office/word/2010/wordprocessingInk" xmlns:wne="http://schemas.microsoft.com/office/word/2006/wordml" xmlns:wps="http://schemas.microsoft.com/office/word/2010/wordprocessingShape" mc:Ignorable="w14 w15 w16se w16cid w16 w16cex w16sdtdh w16sdtfl w16du wp14">
+<w:endnotes xmlns:wpc="http://schemas.microsoft.com/office/word/2010/wordprocessingCanvas" xmlns:cx="http://schemas.microsoft.com/office/drawing/2014/chartex" xmlns:cx1="http://schemas.microsoft.com/office/drawing/2015/9/8/chartex" xmlns:cx2="http://schemas.microsoft.com/office/drawing/2015/10/21/chartex" xmlns:cx3="http://schemas.microsoft.com/office/drawing/2016/5/9/chartex" xmlns:cx4="http://schemas.microsoft.com/office/drawing/2016/5/10/chartex" xmlns:cx5="http://schemas.microsoft.com/office/drawing/2016/5/11/chartex" xmlns:cx6="http://schemas.microsoft.com/office/drawing/2016/5/12/chartex" xmlns:cx7="http://schemas.microsoft.com/office/drawing/2016/5/13/chartex" xmlns:cx8="http://schemas.microsoft.com/office/drawing/2016/5/14/chartex" xmlns:mc="http://schemas.openxmlformats.org/markup-compatibility/2006" xmlns:aink="http://schemas.microsoft.com/office/drawing/2016/ink" xmlns:am3d="http://schemas.microsoft.com/office/drawing/2017/model3d" xmlns:o="urn:schemas-microsoft-com:office:office" xmlns:oel="http://schemas.microsoft.com/office/2019/extlst" xmlns:r="http://schemas.openxmlformats.org/officeDocument/2006/relationships" xmlns:m="http://schemas.openxmlformats.org/officeDocument/2006/math" xmlns:v="urn:schemas-microsoft-com:vml" xmlns:wp14="http://schemas.microsoft.com/office/word/2010/wordprocessingDrawing" xmlns:wp="http://schemas.openxmlformats.org/drawingml/2006/wordprocessingDrawing" xmlns:w10="urn:schemas-microsoft-com:office:word" xmlns:w="http://schemas.openxmlformats.org/wordprocessingml/2006/main" xmlns:w14="http://schemas.microsoft.com/office/word/2010/wordml" xmlns:w15="http://schemas.microsoft.com/office/word/2012/wordml" xmlns:w16cex="http://schemas.microsoft.com/office/word/2018/wordml/cex" xmlns:w16cid="http://schemas.microsoft.com/office/word/2016/wordml/cid" xmlns:w16="http://schemas.microsoft.com/office/word/2018/wordml" xmlns:w16du="http://schemas.microsoft.com/office/word/2023/wordml/word16du" xmlns:w16sdtdh="http://schemas.microsoft.com/office/word/2020/wordml/sdtdatahash" xmlns:w16sdtfl="http://schemas.microsoft.com/office/word/2024/wordml/sdtformatlock" xmlns:w16se="http://schemas.microsoft.com/office/word/2015/wordml/symex" xmlns:wpg="http://schemas.microsoft.com/office/word/2010/wordprocessingGroup" xmlns:wpi="http://schemas.microsoft.com/office/word/2010/wordprocessingInk" xmlns:wne="http://schemas.microsoft.com/office/word/2006/wordml" xmlns:wps="http://schemas.microsoft.com/office/word/2010/wordprocessingShape" mc:Ignorable="w14 w15 w16se w16cid w16 w16cex w16sdtdh w16sdtfl w16du wp14">
   <w:endnote w:type="separator" w:id="-1">
     <w:p>
       <w:pPr>
@@ -11302,7 +11590,7 @@
 </file>
 
 <file path=word/footer1.xml><?xml version="1.0" encoding="utf-8"?>
-<w:ftr xmlns:wpc="http://schemas.microsoft.com/office/word/2010/wordprocessingCanvas" xmlns:cx="http://schemas.microsoft.com/office/drawing/2014/chartex" xmlns:cx1="http://schemas.microsoft.com/office/drawing/2015/9/8/chartex" xmlns:cx2="http://schemas.microsoft.com/office/drawing/2015/10/21/chartex" xmlns:cx3="http://schemas.microsoft.com/office/drawing/2016/5/9/chartex" xmlns:cx4="http://schemas.microsoft.com/office/drawing/2016/5/10/chartex" xmlns:cx5="http://schemas.microsoft.com/office/drawing/2016/5/11/chartex" xmlns:cx6="http://schemas.microsoft.com/office/drawing/2016/5/12/chartex" xmlns:cx7="http://schemas.microsoft.com/office/drawing/2016/5/13/chartex" xmlns:cx8="http://schemas.microsoft.com/office/drawing/2016/5/14/chartex" xmlns:mc="http://schemas.openxmlformats.org/markup-compatibility/2006" xmlns:aink="http://schemas.microsoft.com/office/drawing/2016/ink" xmlns:am3d="http://schemas.microsoft.com/office/drawing/2017/model3d" xmlns:o="urn:schemas-microsoft-com:office:office" xmlns:oel="http://schemas.microsoft.com/office/2019/extlst" xmlns:r="http://schemas.openxmlformats.org/officeDocument/2006/relationships" xmlns:m="http://schemas.openxmlformats.org/officeDocument/2006/math" xmlns:v="urn:schemas-microsoft-com:vml" xmlns:wp14="http://schemas.microsoft.com/office/word/2010/wordprocessingDrawing" xmlns:wp="http://schemas.openxmlformats.org/drawingml/2006/wordprocessingDrawing" xmlns:w10="urn:schemas-microsoft-com:office:word" xmlns:w="http://schemas.openxmlformats.org/wordprocessingml/2006/main" xmlns:w14="http://schemas.microsoft.com/office/word/2010/wordml" xmlns:w15="http://schemas.microsoft.com/office/word/2012/wordml" xmlns:w16cei="http://schemas.microsoft.com/office/word/2026/wordml/cei" xmlns:w16cex="http://schemas.microsoft.com/office/word/2018/wordml/cex" xmlns:w16cid="http://schemas.microsoft.com/office/word/2016/wordml/cid" xmlns:w16="http://schemas.microsoft.com/office/word/2018/wordml" xmlns:w16du="http://schemas.microsoft.com/office/word/2023/wordml/word16du" xmlns:w16sdtdh="http://schemas.microsoft.com/office/word/2020/wordml/sdtdatahash" xmlns:w16sdtfl="http://schemas.microsoft.com/office/word/2024/wordml/sdtformatlock" xmlns:w16se="http://schemas.microsoft.com/office/word/2015/wordml/symex" xmlns:wpg="http://schemas.microsoft.com/office/word/2010/wordprocessingGroup" xmlns:wpi="http://schemas.microsoft.com/office/word/2010/wordprocessingInk" xmlns:wne="http://schemas.microsoft.com/office/word/2006/wordml" xmlns:wps="http://schemas.microsoft.com/office/word/2010/wordprocessingShape" mc:Ignorable="w14 w15 w16se w16cid w16 w16cex w16sdtdh w16sdtfl w16du wp14">
+<w:ftr xmlns:wpc="http://schemas.microsoft.com/office/word/2010/wordprocessingCanvas" xmlns:cx="http://schemas.microsoft.com/office/drawing/2014/chartex" xmlns:cx1="http://schemas.microsoft.com/office/drawing/2015/9/8/chartex" xmlns:cx2="http://schemas.microsoft.com/office/drawing/2015/10/21/chartex" xmlns:cx3="http://schemas.microsoft.com/office/drawing/2016/5/9/chartex" xmlns:cx4="http://schemas.microsoft.com/office/drawing/2016/5/10/chartex" xmlns:cx5="http://schemas.microsoft.com/office/drawing/2016/5/11/chartex" xmlns:cx6="http://schemas.microsoft.com/office/drawing/2016/5/12/chartex" xmlns:cx7="http://schemas.microsoft.com/office/drawing/2016/5/13/chartex" xmlns:cx8="http://schemas.microsoft.com/office/drawing/2016/5/14/chartex" xmlns:mc="http://schemas.openxmlformats.org/markup-compatibility/2006" xmlns:aink="http://schemas.microsoft.com/office/drawing/2016/ink" xmlns:am3d="http://schemas.microsoft.com/office/drawing/2017/model3d" xmlns:o="urn:schemas-microsoft-com:office:office" xmlns:oel="http://schemas.microsoft.com/office/2019/extlst" xmlns:r="http://schemas.openxmlformats.org/officeDocument/2006/relationships" xmlns:m="http://schemas.openxmlformats.org/officeDocument/2006/math" xmlns:v="urn:schemas-microsoft-com:vml" xmlns:wp14="http://schemas.microsoft.com/office/word/2010/wordprocessingDrawing" xmlns:wp="http://schemas.openxmlformats.org/drawingml/2006/wordprocessingDrawing" xmlns:w10="urn:schemas-microsoft-com:office:word" xmlns:w="http://schemas.openxmlformats.org/wordprocessingml/2006/main" xmlns:w14="http://schemas.microsoft.com/office/word/2010/wordml" xmlns:w15="http://schemas.microsoft.com/office/word/2012/wordml" xmlns:w16cex="http://schemas.microsoft.com/office/word/2018/wordml/cex" xmlns:w16cid="http://schemas.microsoft.com/office/word/2016/wordml/cid" xmlns:w16="http://schemas.microsoft.com/office/word/2018/wordml" xmlns:w16du="http://schemas.microsoft.com/office/word/2023/wordml/word16du" xmlns:w16sdtdh="http://schemas.microsoft.com/office/word/2020/wordml/sdtdatahash" xmlns:w16sdtfl="http://schemas.microsoft.com/office/word/2024/wordml/sdtformatlock" xmlns:w16se="http://schemas.microsoft.com/office/word/2015/wordml/symex" xmlns:wpg="http://schemas.microsoft.com/office/word/2010/wordprocessingGroup" xmlns:wpi="http://schemas.microsoft.com/office/word/2010/wordprocessingInk" xmlns:wne="http://schemas.microsoft.com/office/word/2006/wordml" xmlns:wps="http://schemas.microsoft.com/office/word/2010/wordprocessingShape" mc:Ignorable="w14 w15 w16se w16cid w16 w16cex w16sdtdh w16sdtfl w16du wp14">
   <w:p>
     <w:pPr>
       <w:pBdr>
@@ -11377,7 +11665,7 @@
 </file>
 
 <file path=word/footnotes.xml><?xml version="1.0" encoding="utf-8"?>
-<w:footnotes xmlns:wpc="http://schemas.microsoft.com/office/word/2010/wordprocessingCanvas" xmlns:cx="http://schemas.microsoft.com/office/drawing/2014/chartex" xmlns:cx1="http://schemas.microsoft.com/office/drawing/2015/9/8/chartex" xmlns:cx2="http://schemas.microsoft.com/office/drawing/2015/10/21/chartex" xmlns:cx3="http://schemas.microsoft.com/office/drawing/2016/5/9/chartex" xmlns:cx4="http://schemas.microsoft.com/office/drawing/2016/5/10/chartex" xmlns:cx5="http://schemas.microsoft.com/office/drawing/2016/5/11/chartex" xmlns:cx6="http://schemas.microsoft.com/office/drawing/2016/5/12/chartex" xmlns:cx7="http://schemas.microsoft.com/office/drawing/2016/5/13/chartex" xmlns:cx8="http://schemas.microsoft.com/office/drawing/2016/5/14/chartex" xmlns:mc="http://schemas.openxmlformats.org/markup-compatibility/2006" xmlns:aink="http://schemas.microsoft.com/office/drawing/2016/ink" xmlns:am3d="http://schemas.microsoft.com/office/drawing/2017/model3d" xmlns:o="urn:schemas-microsoft-com:office:office" xmlns:oel="http://schemas.microsoft.com/office/2019/extlst" xmlns:r="http://schemas.openxmlformats.org/officeDocument/2006/relationships" xmlns:m="http://schemas.openxmlformats.org/officeDocument/2006/math" xmlns:v="urn:schemas-microsoft-com:vml" xmlns:wp14="http://schemas.microsoft.com/office/word/2010/wordprocessingDrawing" xmlns:wp="http://schemas.openxmlformats.org/drawingml/2006/wordprocessingDrawing" xmlns:w10="urn:schemas-microsoft-com:office:word" xmlns:w="http://schemas.openxmlformats.org/wordprocessingml/2006/main" xmlns:w14="http://schemas.microsoft.com/office/word/2010/wordml" xmlns:w15="http://schemas.microsoft.com/office/word/2012/wordml" xmlns:w16cei="http://schemas.microsoft.com/office/word/2026/wordml/cei" xmlns:w16cex="http://schemas.microsoft.com/office/word/2018/wordml/cex" xmlns:w16cid="http://schemas.microsoft.com/office/word/2016/wordml/cid" xmlns:w16="http://schemas.microsoft.com/office/word/2018/wordml" xmlns:w16du="http://schemas.microsoft.com/office/word/2023/wordml/word16du" xmlns:w16sdtdh="http://schemas.microsoft.com/office/word/2020/wordml/sdtdatahash" xmlns:w16sdtfl="http://schemas.microsoft.com/office/word/2024/wordml/sdtformatlock" xmlns:w16se="http://schemas.microsoft.com/office/word/2015/wordml/symex" xmlns:wpg="http://schemas.microsoft.com/office/word/2010/wordprocessingGroup" xmlns:wpi="http://schemas.microsoft.com/office/word/2010/wordprocessingInk" xmlns:wne="http://schemas.microsoft.com/office/word/2006/wordml" xmlns:wps="http://schemas.microsoft.com/office/word/2010/wordprocessingShape" mc:Ignorable="w14 w15 w16se w16cid w16 w16cex w16sdtdh w16sdtfl w16du wp14">
+<w:footnotes xmlns:wpc="http://schemas.microsoft.com/office/word/2010/wordprocessingCanvas" xmlns:cx="http://schemas.microsoft.com/office/drawing/2014/chartex" xmlns:cx1="http://schemas.microsoft.com/office/drawing/2015/9/8/chartex" xmlns:cx2="http://schemas.microsoft.com/office/drawing/2015/10/21/chartex" xmlns:cx3="http://schemas.microsoft.com/office/drawing/2016/5/9/chartex" xmlns:cx4="http://schemas.microsoft.com/office/drawing/2016/5/10/chartex" xmlns:cx5="http://schemas.microsoft.com/office/drawing/2016/5/11/chartex" xmlns:cx6="http://schemas.microsoft.com/office/drawing/2016/5/12/chartex" xmlns:cx7="http://schemas.microsoft.com/office/drawing/2016/5/13/chartex" xmlns:cx8="http://schemas.microsoft.com/office/drawing/2016/5/14/chartex" xmlns:mc="http://schemas.openxmlformats.org/markup-compatibility/2006" xmlns:aink="http://schemas.microsoft.com/office/drawing/2016/ink" xmlns:am3d="http://schemas.microsoft.com/office/drawing/2017/model3d" xmlns:o="urn:schemas-microsoft-com:office:office" xmlns:oel="http://schemas.microsoft.com/office/2019/extlst" xmlns:r="http://schemas.openxmlformats.org/officeDocument/2006/relationships" xmlns:m="http://schemas.openxmlformats.org/officeDocument/2006/math" xmlns:v="urn:schemas-microsoft-com:vml" xmlns:wp14="http://schemas.microsoft.com/office/word/2010/wordprocessingDrawing" xmlns:wp="http://schemas.openxmlformats.org/drawingml/2006/wordprocessingDrawing" xmlns:w10="urn:schemas-microsoft-com:office:word" xmlns:w="http://schemas.openxmlformats.org/wordprocessingml/2006/main" xmlns:w14="http://schemas.microsoft.com/office/word/2010/wordml" xmlns:w15="http://schemas.microsoft.com/office/word/2012/wordml" xmlns:w16cex="http://schemas.microsoft.com/office/word/2018/wordml/cex" xmlns:w16cid="http://schemas.microsoft.com/office/word/2016/wordml/cid" xmlns:w16="http://schemas.microsoft.com/office/word/2018/wordml" xmlns:w16du="http://schemas.microsoft.com/office/word/2023/wordml/word16du" xmlns:w16sdtdh="http://schemas.microsoft.com/office/word/2020/wordml/sdtdatahash" xmlns:w16sdtfl="http://schemas.microsoft.com/office/word/2024/wordml/sdtformatlock" xmlns:w16se="http://schemas.microsoft.com/office/word/2015/wordml/symex" xmlns:wpg="http://schemas.microsoft.com/office/word/2010/wordprocessingGroup" xmlns:wpi="http://schemas.microsoft.com/office/word/2010/wordprocessingInk" xmlns:wne="http://schemas.microsoft.com/office/word/2006/wordml" xmlns:wps="http://schemas.microsoft.com/office/word/2010/wordprocessingShape" mc:Ignorable="w14 w15 w16se w16cid w16 w16cex w16sdtdh w16sdtfl w16du wp14">
   <w:footnote w:type="separator" w:id="-1">
     <w:p>
       <w:pPr>
@@ -11402,7 +11690,7 @@
 </file>
 
 <file path=word/numbering.xml><?xml version="1.0" encoding="utf-8"?>
-<w:numbering xmlns:wpc="http://schemas.microsoft.com/office/word/2010/wordprocessingCanvas" xmlns:cx="http://schemas.microsoft.com/office/drawing/2014/chartex" xmlns:cx1="http://schemas.microsoft.com/office/drawing/2015/9/8/chartex" xmlns:cx2="http://schemas.microsoft.com/office/drawing/2015/10/21/chartex" xmlns:cx3="http://schemas.microsoft.com/office/drawing/2016/5/9/chartex" xmlns:cx4="http://schemas.microsoft.com/office/drawing/2016/5/10/chartex" xmlns:cx5="http://schemas.microsoft.com/office/drawing/2016/5/11/chartex" xmlns:cx6="http://schemas.microsoft.com/office/drawing/2016/5/12/chartex" xmlns:cx7="http://schemas.microsoft.com/office/drawing/2016/5/13/chartex" xmlns:cx8="http://schemas.microsoft.com/office/drawing/2016/5/14/chartex" xmlns:mc="http://schemas.openxmlformats.org/markup-compatibility/2006" xmlns:aink="http://schemas.microsoft.com/office/drawing/2016/ink" xmlns:am3d="http://schemas.microsoft.com/office/drawing/2017/model3d" xmlns:o="urn:schemas-microsoft-com:office:office" xmlns:oel="http://schemas.microsoft.com/office/2019/extlst" xmlns:r="http://schemas.openxmlformats.org/officeDocument/2006/relationships" xmlns:m="http://schemas.openxmlformats.org/officeDocument/2006/math" xmlns:v="urn:schemas-microsoft-com:vml" xmlns:wp14="http://schemas.microsoft.com/office/word/2010/wordprocessingDrawing" xmlns:wp="http://schemas.openxmlformats.org/drawingml/2006/wordprocessingDrawing" xmlns:w10="urn:schemas-microsoft-com:office:word" xmlns:w="http://schemas.openxmlformats.org/wordprocessingml/2006/main" xmlns:w14="http://schemas.microsoft.com/office/word/2010/wordml" xmlns:w15="http://schemas.microsoft.com/office/word/2012/wordml" xmlns:w16cei="http://schemas.microsoft.com/office/word/2026/wordml/cei" xmlns:w16cex="http://schemas.microsoft.com/office/word/2018/wordml/cex" xmlns:w16cid="http://schemas.microsoft.com/office/word/2016/wordml/cid" xmlns:w16="http://schemas.microsoft.com/office/word/2018/wordml" xmlns:w16du="http://schemas.microsoft.com/office/word/2023/wordml/word16du" xmlns:w16sdtdh="http://schemas.microsoft.com/office/word/2020/wordml/sdtdatahash" xmlns:w16sdtfl="http://schemas.microsoft.com/office/word/2024/wordml/sdtformatlock" xmlns:w16se="http://schemas.microsoft.com/office/word/2015/wordml/symex" xmlns:wpg="http://schemas.microsoft.com/office/word/2010/wordprocessingGroup" xmlns:wpi="http://schemas.microsoft.com/office/word/2010/wordprocessingInk" xmlns:wne="http://schemas.microsoft.com/office/word/2006/wordml" xmlns:wps="http://schemas.microsoft.com/office/word/2010/wordprocessingShape" mc:Ignorable="w14 w15 w16se w16cid w16 w16cex w16sdtdh w16sdtfl w16du wp14">
+<w:numbering xmlns:wpc="http://schemas.microsoft.com/office/word/2010/wordprocessingCanvas" xmlns:cx="http://schemas.microsoft.com/office/drawing/2014/chartex" xmlns:cx1="http://schemas.microsoft.com/office/drawing/2015/9/8/chartex" xmlns:cx2="http://schemas.microsoft.com/office/drawing/2015/10/21/chartex" xmlns:cx3="http://schemas.microsoft.com/office/drawing/2016/5/9/chartex" xmlns:cx4="http://schemas.microsoft.com/office/drawing/2016/5/10/chartex" xmlns:cx5="http://schemas.microsoft.com/office/drawing/2016/5/11/chartex" xmlns:cx6="http://schemas.microsoft.com/office/drawing/2016/5/12/chartex" xmlns:cx7="http://schemas.microsoft.com/office/drawing/2016/5/13/chartex" xmlns:cx8="http://schemas.microsoft.com/office/drawing/2016/5/14/chartex" xmlns:mc="http://schemas.openxmlformats.org/markup-compatibility/2006" xmlns:aink="http://schemas.microsoft.com/office/drawing/2016/ink" xmlns:am3d="http://schemas.microsoft.com/office/drawing/2017/model3d" xmlns:o="urn:schemas-microsoft-com:office:office" xmlns:oel="http://schemas.microsoft.com/office/2019/extlst" xmlns:r="http://schemas.openxmlformats.org/officeDocument/2006/relationships" xmlns:m="http://schemas.openxmlformats.org/officeDocument/2006/math" xmlns:v="urn:schemas-microsoft-com:vml" xmlns:wp14="http://schemas.microsoft.com/office/word/2010/wordprocessingDrawing" xmlns:wp="http://schemas.openxmlformats.org/drawingml/2006/wordprocessingDrawing" xmlns:w10="urn:schemas-microsoft-com:office:word" xmlns:w="http://schemas.openxmlformats.org/wordprocessingml/2006/main" xmlns:w14="http://schemas.microsoft.com/office/word/2010/wordml" xmlns:w15="http://schemas.microsoft.com/office/word/2012/wordml" xmlns:w16cex="http://schemas.microsoft.com/office/word/2018/wordml/cex" xmlns:w16cid="http://schemas.microsoft.com/office/word/2016/wordml/cid" xmlns:w16="http://schemas.microsoft.com/office/word/2018/wordml" xmlns:w16du="http://schemas.microsoft.com/office/word/2023/wordml/word16du" xmlns:w16sdtdh="http://schemas.microsoft.com/office/word/2020/wordml/sdtdatahash" xmlns:w16sdtfl="http://schemas.microsoft.com/office/word/2024/wordml/sdtformatlock" xmlns:w16se="http://schemas.microsoft.com/office/word/2015/wordml/symex" xmlns:wpg="http://schemas.microsoft.com/office/word/2010/wordprocessingGroup" xmlns:wpi="http://schemas.microsoft.com/office/word/2010/wordprocessingInk" xmlns:wne="http://schemas.microsoft.com/office/word/2006/wordml" xmlns:wps="http://schemas.microsoft.com/office/word/2010/wordprocessingShape" mc:Ignorable="w14 w15 w16se w16cid w16 w16cex w16sdtdh w16sdtfl w16du wp14">
   <w:abstractNum w:abstractNumId="0" w15:restartNumberingAfterBreak="0">
     <w:nsid w:val="162F2BB4"/>
     <w:multiLevelType w:val="multilevel"/>
@@ -12027,6 +12315,7 @@
   <w:style w:type="character" w:default="1" w:styleId="DefaultParagraphFont">
     <w:name w:val="Default Paragraph Font"/>
     <w:uiPriority w:val="1"/>
+    <w:semiHidden/>
     <w:unhideWhenUsed/>
   </w:style>
   <w:style w:type="table" w:default="1" w:styleId="TableNormal">

</xml_diff>